<commit_message>
Add wiring diagrams to the build guide
Six diagrams, each placed beside the step it belongs to:

- Thermal (MLX90640) over I2C
- Ultrasonic (HC-SR04) showing the required 1k/2k divider on ECHO,
  with the junction point marked
- Microphone (INMP441) over I2S, with L/R tied to ground
- Chirp emitter through the PAM8302 into the speaker
- The complete node with every module wired to the MCU
- Physical top-down layout: thermal field of view, the two ultrasonic
  cones aimed 20 degrees off centre, and the 3 cm mic-to-speaker gap

One colour code across all six: red 3.3 V, orange 5 V, black ground,
blue/green/purple signals. Generated from a script so they can be
regenerated if the pin plan changes.
</commit_message>
<xml_diff>
--- a/docs/NOVIS_Build_Guide.docx
+++ b/docs/NOVIS_Build_Guide.docx
@@ -1965,6 +1965,58 @@
         <w:t>, a two-wire communication bus.</w:t>
       </w:r>
     </w:p>
+    <w:p>
+      <w:pPr>
+        <w:jc w:val="center"/>
+      </w:pPr>
+      <w:r>
+        <w:drawing>
+          <wp:inline xmlns:a="http://schemas.openxmlformats.org/drawingml/2006/main" xmlns:pic="http://schemas.openxmlformats.org/drawingml/2006/picture">
+            <wp:extent cx="5852160" cy="3280260"/>
+            <wp:docPr id="1" name="Picture 1"/>
+            <wp:cNvGraphicFramePr>
+              <a:graphicFrameLocks noChangeAspect="1"/>
+            </wp:cNvGraphicFramePr>
+            <a:graphic>
+              <a:graphicData uri="http://schemas.openxmlformats.org/drawingml/2006/picture">
+                <pic:pic>
+                  <pic:nvPicPr>
+                    <pic:cNvPr id="0" name="fig_wire_thermal.png"/>
+                    <pic:cNvPicPr/>
+                  </pic:nvPicPr>
+                  <pic:blipFill>
+                    <a:blip r:embed="rId9"/>
+                    <a:stretch>
+                      <a:fillRect/>
+                    </a:stretch>
+                  </pic:blipFill>
+                  <pic:spPr>
+                    <a:xfrm>
+                      <a:off x="0" y="0"/>
+                      <a:ext cx="5852160" cy="3280260"/>
+                    </a:xfrm>
+                    <a:prstGeom prst="rect"/>
+                  </pic:spPr>
+                </pic:pic>
+              </a:graphicData>
+            </a:graphic>
+          </wp:inline>
+        </w:drawing>
+      </w:r>
+    </w:p>
+    <w:p>
+      <w:pPr>
+        <w:jc w:val="center"/>
+      </w:pPr>
+      <w:r>
+        <w:rPr>
+          <w:i/>
+          <w:color w:val="5F6368"/>
+          <w:sz w:val="18"/>
+        </w:rPr>
+        <w:t>Thermal sensor wiring: 3.3 V, GND, SDA and SCL between the nRF52840 and the MLX90640.</w:t>
+      </w:r>
+    </w:p>
     <w:tbl>
       <w:tblPr>
         <w:tblStyle w:val="LightGrid-Accent1"/>
@@ -2692,6 +2744,58 @@
     <w:p>
       <w:r>
         <w:t>to about 3.3 V. You need one for each HC-SR04, so two in total.</w:t>
+      </w:r>
+    </w:p>
+    <w:p>
+      <w:pPr>
+        <w:jc w:val="center"/>
+      </w:pPr>
+      <w:r>
+        <w:drawing>
+          <wp:inline xmlns:a="http://schemas.openxmlformats.org/drawingml/2006/main" xmlns:pic="http://schemas.openxmlformats.org/drawingml/2006/picture">
+            <wp:extent cx="5852160" cy="3768502"/>
+            <wp:docPr id="2" name="Picture 2"/>
+            <wp:cNvGraphicFramePr>
+              <a:graphicFrameLocks noChangeAspect="1"/>
+            </wp:cNvGraphicFramePr>
+            <a:graphic>
+              <a:graphicData uri="http://schemas.openxmlformats.org/drawingml/2006/picture">
+                <pic:pic>
+                  <pic:nvPicPr>
+                    <pic:cNvPr id="0" name="fig_wire_sonar.png"/>
+                    <pic:cNvPicPr/>
+                  </pic:nvPicPr>
+                  <pic:blipFill>
+                    <a:blip r:embed="rId10"/>
+                    <a:stretch>
+                      <a:fillRect/>
+                    </a:stretch>
+                  </pic:blipFill>
+                  <pic:spPr>
+                    <a:xfrm>
+                      <a:off x="0" y="0"/>
+                      <a:ext cx="5852160" cy="3768502"/>
+                    </a:xfrm>
+                    <a:prstGeom prst="rect"/>
+                  </pic:spPr>
+                </pic:pic>
+              </a:graphicData>
+            </a:graphic>
+          </wp:inline>
+        </w:drawing>
+      </w:r>
+    </w:p>
+    <w:p>
+      <w:pPr>
+        <w:jc w:val="center"/>
+      </w:pPr>
+      <w:r>
+        <w:rPr>
+          <w:i/>
+          <w:color w:val="5F6368"/>
+          <w:sz w:val="18"/>
+        </w:rPr>
+        <w:t>Ultrasonic wiring. TRIG connects directly. ECHO goes through a 1 kilohm and 2 kilohm divider, and the middle point between the two resistors is what connects to the board.</w:t>
       </w:r>
     </w:p>
     <w:p>
@@ -3578,6 +3682,58 @@
       </w:pPr>
       <w:r>
         <w:t>Wiring</w:t>
+      </w:r>
+    </w:p>
+    <w:p>
+      <w:pPr>
+        <w:jc w:val="center"/>
+      </w:pPr>
+      <w:r>
+        <w:drawing>
+          <wp:inline xmlns:a="http://schemas.openxmlformats.org/drawingml/2006/main" xmlns:pic="http://schemas.openxmlformats.org/drawingml/2006/picture">
+            <wp:extent cx="5852160" cy="3952297"/>
+            <wp:docPr id="3" name="Picture 3"/>
+            <wp:cNvGraphicFramePr>
+              <a:graphicFrameLocks noChangeAspect="1"/>
+            </wp:cNvGraphicFramePr>
+            <a:graphic>
+              <a:graphicData uri="http://schemas.openxmlformats.org/drawingml/2006/picture">
+                <pic:pic>
+                  <pic:nvPicPr>
+                    <pic:cNvPr id="0" name="fig_wire_mic.png"/>
+                    <pic:cNvPicPr/>
+                  </pic:nvPicPr>
+                  <pic:blipFill>
+                    <a:blip r:embed="rId11"/>
+                    <a:stretch>
+                      <a:fillRect/>
+                    </a:stretch>
+                  </pic:blipFill>
+                  <pic:spPr>
+                    <a:xfrm>
+                      <a:off x="0" y="0"/>
+                      <a:ext cx="5852160" cy="3952297"/>
+                    </a:xfrm>
+                    <a:prstGeom prst="rect"/>
+                  </pic:spPr>
+                </pic:pic>
+              </a:graphicData>
+            </a:graphic>
+          </wp:inline>
+        </w:drawing>
+      </w:r>
+    </w:p>
+    <w:p>
+      <w:pPr>
+        <w:jc w:val="center"/>
+      </w:pPr>
+      <w:r>
+        <w:rPr>
+          <w:i/>
+          <w:color w:val="5F6368"/>
+          <w:sz w:val="18"/>
+        </w:rPr>
+        <w:t>Microphone wiring: 3.3 V, GND, SCK, WS and SD between the nRF52840 and the INMP441, with the L/R pin tied to ground.</w:t>
       </w:r>
     </w:p>
     <w:tbl>
@@ -4529,6 +4685,58 @@
         <w:t>signal loud enough to be useful.</w:t>
       </w:r>
     </w:p>
+    <w:p>
+      <w:pPr>
+        <w:jc w:val="center"/>
+      </w:pPr>
+      <w:r>
+        <w:drawing>
+          <wp:inline xmlns:a="http://schemas.openxmlformats.org/drawingml/2006/main" xmlns:pic="http://schemas.openxmlformats.org/drawingml/2006/picture">
+            <wp:extent cx="5852160" cy="3618095"/>
+            <wp:docPr id="4" name="Picture 4"/>
+            <wp:cNvGraphicFramePr>
+              <a:graphicFrameLocks noChangeAspect="1"/>
+            </wp:cNvGraphicFramePr>
+            <a:graphic>
+              <a:graphicData uri="http://schemas.openxmlformats.org/drawingml/2006/picture">
+                <pic:pic>
+                  <pic:nvPicPr>
+                    <pic:cNvPr id="0" name="fig_wire_speaker.png"/>
+                    <pic:cNvPicPr/>
+                  </pic:nvPicPr>
+                  <pic:blipFill>
+                    <a:blip r:embed="rId12"/>
+                    <a:stretch>
+                      <a:fillRect/>
+                    </a:stretch>
+                  </pic:blipFill>
+                  <pic:spPr>
+                    <a:xfrm>
+                      <a:off x="0" y="0"/>
+                      <a:ext cx="5852160" cy="3618095"/>
+                    </a:xfrm>
+                    <a:prstGeom prst="rect"/>
+                  </pic:spPr>
+                </pic:pic>
+              </a:graphicData>
+            </a:graphic>
+          </wp:inline>
+        </w:drawing>
+      </w:r>
+    </w:p>
+    <w:p>
+      <w:pPr>
+        <w:jc w:val="center"/>
+      </w:pPr>
+      <w:r>
+        <w:rPr>
+          <w:i/>
+          <w:color w:val="5F6368"/>
+          <w:sz w:val="18"/>
+        </w:rPr>
+        <w:t>Chirp emitter wiring: the nRF52840 PWM pin drives the PAM8302 input, and the amplifier output drives the speaker.</w:t>
+      </w:r>
+    </w:p>
     <w:tbl>
       <w:tblPr>
         <w:tblStyle w:val="LightGrid-Accent1"/>
@@ -5069,6 +5277,58 @@
     <w:p>
       <w:r>
         <w:t>Now connect everything at once, on one breadboard.</w:t>
+      </w:r>
+    </w:p>
+    <w:p>
+      <w:pPr>
+        <w:jc w:val="center"/>
+      </w:pPr>
+      <w:r>
+        <w:drawing>
+          <wp:inline xmlns:a="http://schemas.openxmlformats.org/drawingml/2006/main" xmlns:pic="http://schemas.openxmlformats.org/drawingml/2006/picture">
+            <wp:extent cx="5852160" cy="4734005"/>
+            <wp:docPr id="5" name="Picture 5"/>
+            <wp:cNvGraphicFramePr>
+              <a:graphicFrameLocks noChangeAspect="1"/>
+            </wp:cNvGraphicFramePr>
+            <a:graphic>
+              <a:graphicData uri="http://schemas.openxmlformats.org/drawingml/2006/picture">
+                <pic:pic>
+                  <pic:nvPicPr>
+                    <pic:cNvPr id="0" name="fig_wire_full.png"/>
+                    <pic:cNvPicPr/>
+                  </pic:nvPicPr>
+                  <pic:blipFill>
+                    <a:blip r:embed="rId13"/>
+                    <a:stretch>
+                      <a:fillRect/>
+                    </a:stretch>
+                  </pic:blipFill>
+                  <pic:spPr>
+                    <a:xfrm>
+                      <a:off x="0" y="0"/>
+                      <a:ext cx="5852160" cy="4734005"/>
+                    </a:xfrm>
+                    <a:prstGeom prst="rect"/>
+                  </pic:spPr>
+                </pic:pic>
+              </a:graphicData>
+            </a:graphic>
+          </wp:inline>
+        </w:drawing>
+      </w:r>
+    </w:p>
+    <w:p>
+      <w:pPr>
+        <w:jc w:val="center"/>
+      </w:pPr>
+      <w:r>
+        <w:rPr>
+          <w:i/>
+          <w:color w:val="5F6368"/>
+          <w:sz w:val="18"/>
+        </w:rPr>
+        <w:t>The complete node: thermal, two ultrasonic modules, microphone, amplifier and speaker all connected to the nRF52840, powered by the LiPo cell.</w:t>
       </w:r>
     </w:p>
     <w:p>
@@ -5445,6 +5705,58 @@
       </w:r>
       <w:r>
         <w:t xml:space="preserve"> as the thermal array</w:t>
+      </w:r>
+    </w:p>
+    <w:p>
+      <w:pPr>
+        <w:jc w:val="center"/>
+      </w:pPr>
+      <w:r>
+        <w:drawing>
+          <wp:inline xmlns:a="http://schemas.openxmlformats.org/drawingml/2006/main" xmlns:pic="http://schemas.openxmlformats.org/drawingml/2006/picture">
+            <wp:extent cx="5852160" cy="3727074"/>
+            <wp:docPr id="6" name="Picture 6"/>
+            <wp:cNvGraphicFramePr>
+              <a:graphicFrameLocks noChangeAspect="1"/>
+            </wp:cNvGraphicFramePr>
+            <a:graphic>
+              <a:graphicData uri="http://schemas.openxmlformats.org/drawingml/2006/picture">
+                <pic:pic>
+                  <pic:nvPicPr>
+                    <pic:cNvPr id="0" name="fig_layout.png"/>
+                    <pic:cNvPicPr/>
+                  </pic:nvPicPr>
+                  <pic:blipFill>
+                    <a:blip r:embed="rId14"/>
+                    <a:stretch>
+                      <a:fillRect/>
+                    </a:stretch>
+                  </pic:blipFill>
+                  <pic:spPr>
+                    <a:xfrm>
+                      <a:off x="0" y="0"/>
+                      <a:ext cx="5852160" cy="3727074"/>
+                    </a:xfrm>
+                    <a:prstGeom prst="rect"/>
+                  </pic:spPr>
+                </pic:pic>
+              </a:graphicData>
+            </a:graphic>
+          </wp:inline>
+        </w:drawing>
+      </w:r>
+    </w:p>
+    <w:p>
+      <w:pPr>
+        <w:jc w:val="center"/>
+      </w:pPr>
+      <w:r>
+        <w:rPr>
+          <w:i/>
+          <w:color w:val="5F6368"/>
+          <w:sz w:val="18"/>
+        </w:rPr>
+        <w:t>Top view of the node showing the thermal field of view, the two ultrasonic cones aimed 20 degrees left and right, and the 3 cm gap between the microphone and the speaker.</w:t>
       </w:r>
     </w:p>
     <w:p>

</xml_diff>